<commit_message>
Date: 30 Jan 2026
</commit_message>
<xml_diff>
--- a/WebDriver Assignments.docx
+++ b/WebDriver Assignments.docx
@@ -4563,43 +4563,103 @@
           <w:highlight w:val="yellow"/>
           <w:lang w:val="en-US"/>
         </w:rPr>
-        <w:t>Click on Enter In</w:t>
-      </w:r>
+        <w:t>Click on Enter Insurant Data</w:t>
+      </w:r>
+    </w:p>
+    <w:p>
+      <w:pPr>
+        <w:pStyle w:val="ListParagraph"/>
+        <w:numPr>
+          <w:ilvl w:val="1"/>
+          <w:numId w:val="1"/>
+        </w:numPr>
+        <w:rPr>
+          <w:sz w:val="24"/>
+          <w:szCs w:val="22"/>
+          <w:highlight w:val="yellow"/>
+          <w:lang w:val="en-US"/>
+        </w:rPr>
+      </w:pPr>
+      <w:r>
+        <w:rPr>
+          <w:sz w:val="24"/>
+          <w:szCs w:val="24"/>
+          <w:highlight w:val="yellow"/>
+          <w:lang w:val="en-US"/>
+        </w:rPr>
+        <w:t>Upload your picture</w:t>
+      </w:r>
+    </w:p>
+    <w:p>
+      <w:pPr>
+        <w:pStyle w:val="ListParagraph"/>
+        <w:numPr>
+          <w:ilvl w:val="0"/>
+          <w:numId w:val="1"/>
+        </w:numPr>
+        <w:rPr>
+          <w:sz w:val="24"/>
+          <w:szCs w:val="22"/>
+          <w:lang w:val="en-US"/>
+        </w:rPr>
+      </w:pPr>
+      <w:r>
+        <w:rPr>
+          <w:sz w:val="24"/>
+          <w:szCs w:val="24"/>
+          <w:lang w:val="en-US"/>
+        </w:rPr>
+        <w:t xml:space="preserve">Open </w:t>
+      </w:r>
+      <w:hyperlink r:id="rId33" w:history="1">
+        <w:r>
+          <w:rPr>
+            <w:rStyle w:val="Hyperlink"/>
+            <w:sz w:val="24"/>
+            <w:szCs w:val="24"/>
+            <w:lang w:val="en-US"/>
+          </w:rPr>
+          <w:t>https://istqb.in/</w:t>
+        </w:r>
+      </w:hyperlink>
+    </w:p>
+    <w:p>
+      <w:pPr>
+        <w:pStyle w:val="ListParagraph"/>
+        <w:numPr>
+          <w:ilvl w:val="1"/>
+          <w:numId w:val="1"/>
+        </w:numPr>
+        <w:rPr>
+          <w:sz w:val="24"/>
+          <w:szCs w:val="22"/>
+          <w:lang w:val="en-US"/>
+        </w:rPr>
+      </w:pPr>
+      <w:r>
+        <w:rPr>
+          <w:sz w:val="24"/>
+          <w:szCs w:val="22"/>
+          <w:lang w:val="en-US"/>
+        </w:rPr>
+        <w:t>Display all 8 menus</w:t>
+      </w:r>
+    </w:p>
+    <w:p>
+      <w:pPr>
+        <w:pStyle w:val="ListParagraph"/>
+        <w:numPr>
+          <w:ilvl w:val="0"/>
+          <w:numId w:val="1"/>
+        </w:numPr>
+        <w:rPr>
+          <w:sz w:val="24"/>
+          <w:szCs w:val="22"/>
+          <w:lang w:val="en-US"/>
+        </w:rPr>
+      </w:pPr>
       <w:bookmarkStart w:id="0" w:name="_GoBack"/>
       <w:bookmarkEnd w:id="0"/>
-      <w:r>
-        <w:rPr>
-          <w:sz w:val="24"/>
-          <w:szCs w:val="24"/>
-          <w:highlight w:val="yellow"/>
-          <w:lang w:val="en-US"/>
-        </w:rPr>
-        <w:t>surant Data</w:t>
-      </w:r>
-    </w:p>
-    <w:p>
-      <w:pPr>
-        <w:pStyle w:val="ListParagraph"/>
-        <w:numPr>
-          <w:ilvl w:val="1"/>
-          <w:numId w:val="1"/>
-        </w:numPr>
-        <w:rPr>
-          <w:sz w:val="24"/>
-          <w:szCs w:val="22"/>
-          <w:highlight w:val="yellow"/>
-          <w:lang w:val="en-US"/>
-        </w:rPr>
-      </w:pPr>
-      <w:r>
-        <w:rPr>
-          <w:sz w:val="24"/>
-          <w:szCs w:val="24"/>
-          <w:highlight w:val="yellow"/>
-          <w:lang w:val="en-US"/>
-        </w:rPr>
-        <w:t>Upload your picture</w:t>
-      </w:r>
     </w:p>
     <w:sectPr>
       <w:pgSz w:w="11906" w:h="16838"/>

</xml_diff>

<commit_message>
Date: 04 Feb 2026
</commit_message>
<xml_diff>
--- a/WebDriver Assignments.docx
+++ b/WebDriver Assignments.docx
@@ -4643,6 +4643,126 @@
           <w:lang w:val="en-US"/>
         </w:rPr>
         <w:t>Display all 8 menus</w:t>
+      </w:r>
+    </w:p>
+    <w:p>
+      <w:pPr>
+        <w:pStyle w:val="ListParagraph"/>
+        <w:numPr>
+          <w:ilvl w:val="0"/>
+          <w:numId w:val="1"/>
+        </w:numPr>
+        <w:rPr>
+          <w:sz w:val="24"/>
+          <w:szCs w:val="22"/>
+          <w:lang w:val="en-US"/>
+        </w:rPr>
+      </w:pPr>
+      <w:r>
+        <w:rPr>
+          <w:sz w:val="24"/>
+          <w:szCs w:val="22"/>
+          <w:lang w:val="en-US"/>
+        </w:rPr>
+        <w:t xml:space="preserve">Open </w:t>
+      </w:r>
+      <w:hyperlink r:id="rId34" w:history="1">
+        <w:r>
+          <w:rPr>
+            <w:rStyle w:val="Hyperlink"/>
+            <w:sz w:val="24"/>
+            <w:szCs w:val="22"/>
+            <w:lang w:val="en-US"/>
+          </w:rPr>
+          <w:t>https://testautomationpractice.blogspot.com/?m=1</w:t>
+        </w:r>
+      </w:hyperlink>
+    </w:p>
+    <w:p>
+      <w:pPr>
+        <w:pStyle w:val="ListParagraph"/>
+        <w:numPr>
+          <w:ilvl w:val="1"/>
+          <w:numId w:val="1"/>
+        </w:numPr>
+        <w:rPr>
+          <w:sz w:val="24"/>
+          <w:szCs w:val="22"/>
+          <w:lang w:val="en-US"/>
+        </w:rPr>
+      </w:pPr>
+      <w:r>
+        <w:rPr>
+          <w:sz w:val="24"/>
+          <w:szCs w:val="22"/>
+          <w:lang w:val="en-US"/>
+        </w:rPr>
+        <w:t>Double click on Copy Text button</w:t>
+      </w:r>
+    </w:p>
+    <w:p>
+      <w:pPr>
+        <w:pStyle w:val="ListParagraph"/>
+        <w:numPr>
+          <w:ilvl w:val="1"/>
+          <w:numId w:val="1"/>
+        </w:numPr>
+        <w:rPr>
+          <w:sz w:val="24"/>
+          <w:szCs w:val="22"/>
+          <w:lang w:val="en-US"/>
+        </w:rPr>
+      </w:pPr>
+      <w:r>
+        <w:rPr>
+          <w:sz w:val="24"/>
+          <w:szCs w:val="22"/>
+          <w:lang w:val="en-US"/>
+        </w:rPr>
+        <w:t>Make sure that the text from 1</w:t>
+      </w:r>
+      <w:r>
+        <w:rPr>
+          <w:sz w:val="24"/>
+          <w:szCs w:val="22"/>
+          <w:vertAlign w:val="superscript"/>
+          <w:lang w:val="en-US"/>
+        </w:rPr>
+        <w:t>st</w:t>
+      </w:r>
+      <w:r>
+        <w:rPr>
+          <w:sz w:val="24"/>
+          <w:szCs w:val="22"/>
+          <w:lang w:val="en-US"/>
+        </w:rPr>
+        <w:t xml:space="preserve"> text box is copied to the 2</w:t>
+      </w:r>
+      <w:r>
+        <w:rPr>
+          <w:sz w:val="24"/>
+          <w:szCs w:val="22"/>
+          <w:vertAlign w:val="superscript"/>
+          <w:lang w:val="en-US"/>
+        </w:rPr>
+        <w:t>nd</w:t>
+      </w:r>
+      <w:r>
+        <w:rPr>
+          <w:sz w:val="24"/>
+          <w:szCs w:val="22"/>
+          <w:lang w:val="en-US"/>
+        </w:rPr>
+        <w:t xml:space="preserve"> text box.</w:t>
+      </w:r>
+      <w:r>
+        <w:rPr>
+          <w:sz w:val="24"/>
+          <w:szCs w:val="22"/>
+          <w:lang w:val="en-US"/>
+        </w:rPr>
+        <w:br/>
+        <w:t>(Check the values / text from both text boxes that is equal or not)</w:t>
       </w:r>
     </w:p>
     <w:p>

</xml_diff>

<commit_message>
Date: 19 Feb 2026
</commit_message>
<xml_diff>
--- a/WebDriver Assignments.docx
+++ b/WebDriver Assignments.docx
@@ -5341,14 +5341,265 @@
     </w:p>
     <w:p>
       <w:pPr>
-        <w:rPr>
-          <w:sz w:val="24"/>
-          <w:szCs w:val="22"/>
-          <w:lang w:val="en-US"/>
-        </w:rPr>
-      </w:pPr>
-      <w:bookmarkStart w:id="0" w:name="_GoBack"/>
-      <w:bookmarkEnd w:id="0"/>
+        <w:pStyle w:val="ListParagraph"/>
+        <w:numPr>
+          <w:ilvl w:val="0"/>
+          <w:numId w:val="5"/>
+        </w:numPr>
+        <w:rPr>
+          <w:sz w:val="24"/>
+          <w:szCs w:val="22"/>
+          <w:lang w:val="en-US"/>
+        </w:rPr>
+      </w:pPr>
+      <w:r>
+        <w:rPr>
+          <w:sz w:val="24"/>
+          <w:szCs w:val="22"/>
+          <w:lang w:val="en-US"/>
+        </w:rPr>
+        <w:t>Create following structure in Excel file</w:t>
+      </w:r>
+      <w:r>
+        <w:rPr>
+          <w:sz w:val="24"/>
+          <w:szCs w:val="22"/>
+          <w:lang w:val="en-US"/>
+        </w:rPr>
+        <w:br/>
+      </w:r>
+    </w:p>
+    <w:tbl>
+      <w:tblPr>
+        <w:tblStyle w:val="TableGrid"/>
+        <w:tblW w:w="0" w:type="auto"/>
+        <w:tblInd w:w="720" w:type="dxa"/>
+        <w:tblLook w:val="04A0" w:firstRow="1" w:lastRow="0" w:firstColumn="1" w:lastColumn="0" w:noHBand="0" w:noVBand="1"/>
+      </w:tblPr>
+      <w:tblGrid>
+        <w:gridCol w:w="4130"/>
+        <w:gridCol w:w="4166"/>
+      </w:tblGrid>
+      <w:tr>
+        <w:tc>
+          <w:tcPr>
+            <w:tcW w:w="4508" w:type="dxa"/>
+          </w:tcPr>
+          <w:p>
+            <w:pPr>
+              <w:rPr>
+                <w:sz w:val="24"/>
+                <w:szCs w:val="22"/>
+                <w:lang w:val="en-US"/>
+              </w:rPr>
+            </w:pPr>
+            <w:proofErr w:type="spellStart"/>
+            <w:r>
+              <w:rPr>
+                <w:sz w:val="24"/>
+                <w:szCs w:val="22"/>
+                <w:lang w:val="en-US"/>
+              </w:rPr>
+              <w:t>Ila</w:t>
+            </w:r>
+            <w:proofErr w:type="spellEnd"/>
+          </w:p>
+        </w:tc>
+        <w:tc>
+          <w:tcPr>
+            <w:tcW w:w="4508" w:type="dxa"/>
+          </w:tcPr>
+          <w:p>
+            <w:pPr>
+              <w:rPr>
+                <w:sz w:val="24"/>
+                <w:szCs w:val="22"/>
+                <w:lang w:val="en-US"/>
+              </w:rPr>
+            </w:pPr>
+            <w:proofErr w:type="spellStart"/>
+            <w:r>
+              <w:rPr>
+                <w:sz w:val="24"/>
+                <w:szCs w:val="22"/>
+                <w:lang w:val="en-US"/>
+              </w:rPr>
+              <w:t>Vashishath</w:t>
+            </w:r>
+            <w:proofErr w:type="spellEnd"/>
+          </w:p>
+        </w:tc>
+      </w:tr>
+      <w:tr>
+        <w:tc>
+          <w:tcPr>
+            <w:tcW w:w="4508" w:type="dxa"/>
+          </w:tcPr>
+          <w:p>
+            <w:pPr>
+              <w:rPr>
+                <w:sz w:val="24"/>
+                <w:szCs w:val="22"/>
+                <w:lang w:val="en-US"/>
+              </w:rPr>
+            </w:pPr>
+            <w:proofErr w:type="spellStart"/>
+            <w:r>
+              <w:rPr>
+                <w:sz w:val="24"/>
+                <w:szCs w:val="22"/>
+                <w:lang w:val="en-US"/>
+              </w:rPr>
+              <w:t>Tavisha</w:t>
+            </w:r>
+            <w:proofErr w:type="spellEnd"/>
+          </w:p>
+        </w:tc>
+        <w:tc>
+          <w:tcPr>
+            <w:tcW w:w="4508" w:type="dxa"/>
+          </w:tcPr>
+          <w:p>
+            <w:pPr>
+              <w:rPr>
+                <w:sz w:val="24"/>
+                <w:szCs w:val="22"/>
+                <w:lang w:val="en-US"/>
+              </w:rPr>
+            </w:pPr>
+            <w:proofErr w:type="spellStart"/>
+            <w:r>
+              <w:rPr>
+                <w:sz w:val="24"/>
+                <w:szCs w:val="22"/>
+                <w:lang w:val="en-US"/>
+              </w:rPr>
+              <w:t>Vashishath</w:t>
+            </w:r>
+            <w:proofErr w:type="spellEnd"/>
+          </w:p>
+        </w:tc>
+      </w:tr>
+      <w:tr>
+        <w:tc>
+          <w:tcPr>
+            <w:tcW w:w="4508" w:type="dxa"/>
+          </w:tcPr>
+          <w:p>
+            <w:pPr>
+              <w:rPr>
+                <w:sz w:val="24"/>
+                <w:szCs w:val="22"/>
+                <w:lang w:val="en-US"/>
+              </w:rPr>
+            </w:pPr>
+            <w:proofErr w:type="spellStart"/>
+            <w:r>
+              <w:rPr>
+                <w:sz w:val="24"/>
+                <w:szCs w:val="22"/>
+                <w:lang w:val="en-US"/>
+              </w:rPr>
+              <w:t>Parth</w:t>
+            </w:r>
+            <w:proofErr w:type="spellEnd"/>
+          </w:p>
+        </w:tc>
+        <w:tc>
+          <w:tcPr>
+            <w:tcW w:w="4508" w:type="dxa"/>
+          </w:tcPr>
+          <w:p>
+            <w:pPr>
+              <w:rPr>
+                <w:sz w:val="24"/>
+                <w:szCs w:val="22"/>
+                <w:lang w:val="en-US"/>
+              </w:rPr>
+            </w:pPr>
+            <w:proofErr w:type="spellStart"/>
+            <w:r>
+              <w:rPr>
+                <w:sz w:val="24"/>
+                <w:szCs w:val="22"/>
+                <w:lang w:val="en-US"/>
+              </w:rPr>
+              <w:t>Vashishath</w:t>
+            </w:r>
+            <w:proofErr w:type="spellEnd"/>
+          </w:p>
+        </w:tc>
+      </w:tr>
+      <w:tr>
+        <w:tc>
+          <w:tcPr>
+            <w:tcW w:w="4508" w:type="dxa"/>
+          </w:tcPr>
+          <w:p>
+            <w:pPr>
+              <w:rPr>
+                <w:sz w:val="24"/>
+                <w:szCs w:val="22"/>
+                <w:lang w:val="en-US"/>
+              </w:rPr>
+            </w:pPr>
+            <w:r>
+              <w:rPr>
+                <w:sz w:val="24"/>
+                <w:szCs w:val="22"/>
+                <w:lang w:val="en-US"/>
+              </w:rPr>
+              <w:t>Vishal</w:t>
+            </w:r>
+          </w:p>
+        </w:tc>
+        <w:tc>
+          <w:tcPr>
+            <w:tcW w:w="4508" w:type="dxa"/>
+          </w:tcPr>
+          <w:p>
+            <w:pPr>
+              <w:rPr>
+                <w:sz w:val="24"/>
+                <w:szCs w:val="22"/>
+                <w:lang w:val="en-US"/>
+              </w:rPr>
+            </w:pPr>
+            <w:r>
+              <w:rPr>
+                <w:sz w:val="24"/>
+                <w:szCs w:val="22"/>
+                <w:lang w:val="en-US"/>
+              </w:rPr>
+              <w:t>Vashis</w:t>
+            </w:r>
+            <w:bookmarkStart w:id="0" w:name="_GoBack"/>
+            <w:bookmarkEnd w:id="0"/>
+            <w:r>
+              <w:rPr>
+                <w:sz w:val="24"/>
+                <w:szCs w:val="22"/>
+                <w:lang w:val="en-US"/>
+              </w:rPr>
+              <w:t>hath</w:t>
+            </w:r>
+          </w:p>
+        </w:tc>
+      </w:tr>
+    </w:tbl>
+    <w:p>
+      <w:pPr>
+        <w:pStyle w:val="ListParagraph"/>
+        <w:numPr>
+          <w:ilvl w:val="0"/>
+          <w:numId w:val="5"/>
+        </w:numPr>
+        <w:rPr>
+          <w:sz w:val="24"/>
+          <w:szCs w:val="22"/>
+          <w:lang w:val="en-US"/>
+        </w:rPr>
+      </w:pPr>
     </w:p>
     <w:sectPr>
       <w:pgSz w:w="11906" w:h="16838"/>
@@ -6208,6 +6459,32 @@
       <w:u w:val="single"/>
     </w:rPr>
   </w:style>
+  <w:style w:type="table" w:styleId="TableGrid">
+    <w:name w:val="Table Grid"/>
+    <w:basedOn w:val="TableNormal"/>
+    <w:uiPriority w:val="39"/>
+    <w:rsid w:val="00BE32CE"/>
+    <w:pPr>
+      <w:spacing w:after="0" w:line="240" w:lineRule="auto"/>
+    </w:pPr>
+    <w:tblPr>
+      <w:tblInd w:w="0" w:type="dxa"/>
+      <w:tblBorders>
+        <w:top w:val="single" w:sz="4" w:space="0" w:color="auto"/>
+        <w:left w:val="single" w:sz="4" w:space="0" w:color="auto"/>
+        <w:bottom w:val="single" w:sz="4" w:space="0" w:color="auto"/>
+        <w:right w:val="single" w:sz="4" w:space="0" w:color="auto"/>
+        <w:insideH w:val="single" w:sz="4" w:space="0" w:color="auto"/>
+        <w:insideV w:val="single" w:sz="4" w:space="0" w:color="auto"/>
+      </w:tblBorders>
+      <w:tblCellMar>
+        <w:top w:w="0" w:type="dxa"/>
+        <w:left w:w="108" w:type="dxa"/>
+        <w:bottom w:w="0" w:type="dxa"/>
+        <w:right w:w="108" w:type="dxa"/>
+      </w:tblCellMar>
+    </w:tblPr>
+  </w:style>
 </w:styles>
 </file>
 

</xml_diff>